<commit_message>
Fixed Math table section.
</commit_message>
<xml_diff>
--- a/templates/docx_templates/curriculum_design_build_master.docx
+++ b/templates/docx_templates/curriculum_design_build_master.docx
@@ -2527,7 +2527,23 @@
           <w:rFonts w:eastAsia="Georgia" w:cs="Georgia"/>
           <w:color w:val="000000" w:themeColor="text1"/>
         </w:rPr>
-        <w:t>the appropriate grade level</w:t>
+        <w:t xml:space="preserve">{{ </w:t>
+      </w:r>
+      <w:proofErr w:type="spellStart"/>
+      <w:r>
+        <w:rPr>
+          <w:rFonts w:eastAsia="Georgia" w:cs="Georgia"/>
+          <w:color w:val="000000" w:themeColor="text1"/>
+        </w:rPr>
+        <w:t>grade.level</w:t>
+      </w:r>
+      <w:proofErr w:type="spellEnd"/>
+      <w:r>
+        <w:rPr>
+          <w:rFonts w:eastAsia="Georgia" w:cs="Georgia"/>
+          <w:color w:val="000000" w:themeColor="text1"/>
+        </w:rPr>
+        <w:t xml:space="preserve"> }}</w:t>
       </w:r>
       <w:r>
         <w:rPr>
@@ -3406,7 +3422,7 @@
             </wp:anchor>
           </w:drawing>
         </mc:Choice>
-        <mc:Fallback xmlns:a14="http://schemas.microsoft.com/office/drawing/2010/main" xmlns:pic="http://schemas.openxmlformats.org/drawingml/2006/picture" xmlns:a="http://schemas.openxmlformats.org/drawingml/2006/main">
+        <mc:Fallback xmlns:a="http://schemas.openxmlformats.org/drawingml/2006/main" xmlns:pic="http://schemas.openxmlformats.org/drawingml/2006/picture" xmlns:a14="http://schemas.microsoft.com/office/drawing/2010/main">
           <w:pict w14:anchorId="693A564B">
             <v:line id="Straight Connector 2" style="position:absolute;z-index:251663360;visibility:visible;mso-wrap-style:square;mso-width-percent:0;mso-height-percent:0;mso-wrap-distance-left:9pt;mso-wrap-distance-top:0;mso-wrap-distance-right:9pt;mso-wrap-distance-bottom:0;mso-position-horizontal:absolute;mso-position-horizontal-relative:text;mso-position-vertical:absolute;mso-position-vertical-relative:text;mso-width-percent:0;mso-height-percent:0;mso-width-relative:margin;mso-height-relative:margin" o:spid="_x0000_s1026" strokecolor="#6a6a68" strokeweight="1.25pt" from="-.15pt,-.45pt" to="480.1pt,-.45pt" w14:anchorId="1D94754B" o:gfxdata="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">
               <v:stroke joinstyle="miter"/>
@@ -3841,7 +3857,7 @@
             </wp:anchor>
           </w:drawing>
         </mc:Choice>
-        <mc:Fallback xmlns:a14="http://schemas.microsoft.com/office/drawing/2010/main" xmlns:pic="http://schemas.openxmlformats.org/drawingml/2006/picture" xmlns:a="http://schemas.openxmlformats.org/drawingml/2006/main">
+        <mc:Fallback xmlns:a="http://schemas.openxmlformats.org/drawingml/2006/main" xmlns:pic="http://schemas.openxmlformats.org/drawingml/2006/picture" xmlns:a14="http://schemas.microsoft.com/office/drawing/2010/main">
           <w:pict w14:anchorId="62C7E224">
             <v:line id="Straight Connector 5" style="position:absolute;z-index:251660288;visibility:visible;mso-wrap-style:square;mso-width-percent:0;mso-height-percent:0;mso-wrap-distance-left:9pt;mso-wrap-distance-top:0;mso-wrap-distance-right:9pt;mso-wrap-distance-bottom:0;mso-position-horizontal:absolute;mso-position-horizontal-relative:text;mso-position-vertical:absolute;mso-position-vertical-relative:text;mso-width-percent:0;mso-height-percent:0;mso-width-relative:margin;mso-height-relative:margin" o:spid="_x0000_s1026" strokecolor="#6a6a68" strokeweight="1.25pt" from="0,5.8pt" to="480.25pt,5.8pt" w14:anchorId="2548742B" o:gfxdata="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">
               <v:stroke joinstyle="miter"/>
@@ -6191,29 +6207,12 @@
 </file>
 
 <file path=customXml/item1.xml><?xml version="1.0" encoding="utf-8"?>
-<p:properties xmlns:p="http://schemas.microsoft.com/office/2006/metadata/properties" xmlns:xsi="http://www.w3.org/2001/XMLSchema-instance" xmlns:pc="http://schemas.microsoft.com/office/infopath/2007/PartnerControls">
-  <documentManagement>
-    <Use xmlns="d598189d-5e7f-4257-b434-a18cd152a466" xsi:nil="true"/>
-    <Notes xmlns="d598189d-5e7f-4257-b434-a18cd152a466" xsi:nil="true"/>
-    <SharedWithUsers xmlns="1be0cd79-b20d-4c5a-bbde-e8a9c50088cd">
-      <UserInfo>
-        <DisplayName>Courtney Fangue</DisplayName>
-        <AccountId>15</AccountId>
-        <AccountType/>
-      </UserInfo>
-      <UserInfo>
-        <DisplayName>Karen Moore</DisplayName>
-        <AccountId>16</AccountId>
-        <AccountType/>
-      </UserInfo>
-      <UserInfo>
-        <DisplayName>Heidi Broussard</DisplayName>
-        <AccountId>17</AccountId>
-        <AccountType/>
-      </UserInfo>
-    </SharedWithUsers>
-  </documentManagement>
-</p:properties>
+<?mso-contentType ?>
+<FormTemplates xmlns="http://schemas.microsoft.com/sharepoint/v3/contenttype/forms">
+  <Display>DocumentLibraryForm</Display>
+  <Edit>DocumentLibraryForm</Edit>
+  <New>DocumentLibraryForm</New>
+</FormTemplates>
 </file>
 
 <file path=customXml/item2.xml><?xml version="1.0" encoding="utf-8"?>
@@ -6413,21 +6412,35 @@
 </file>
 
 <file path=customXml/item3.xml><?xml version="1.0" encoding="utf-8"?>
-<?mso-contentType ?>
-<FormTemplates xmlns="http://schemas.microsoft.com/sharepoint/v3/contenttype/forms">
-  <Display>DocumentLibraryForm</Display>
-  <Edit>DocumentLibraryForm</Edit>
-  <New>DocumentLibraryForm</New>
-</FormTemplates>
+<p:properties xmlns:p="http://schemas.microsoft.com/office/2006/metadata/properties" xmlns:xsi="http://www.w3.org/2001/XMLSchema-instance" xmlns:pc="http://schemas.microsoft.com/office/infopath/2007/PartnerControls">
+  <documentManagement>
+    <Use xmlns="d598189d-5e7f-4257-b434-a18cd152a466" xsi:nil="true"/>
+    <Notes xmlns="d598189d-5e7f-4257-b434-a18cd152a466" xsi:nil="true"/>
+    <SharedWithUsers xmlns="1be0cd79-b20d-4c5a-bbde-e8a9c50088cd">
+      <UserInfo>
+        <DisplayName>Courtney Fangue</DisplayName>
+        <AccountId>15</AccountId>
+        <AccountType/>
+      </UserInfo>
+      <UserInfo>
+        <DisplayName>Karen Moore</DisplayName>
+        <AccountId>16</AccountId>
+        <AccountType/>
+      </UserInfo>
+      <UserInfo>
+        <DisplayName>Heidi Broussard</DisplayName>
+        <AccountId>17</AccountId>
+        <AccountType/>
+      </UserInfo>
+    </SharedWithUsers>
+  </documentManagement>
+</p:properties>
 </file>
 
 <file path=customXml/itemProps1.xml><?xml version="1.0" encoding="utf-8"?>
-<ds:datastoreItem xmlns:ds="http://schemas.openxmlformats.org/officeDocument/2006/customXml" ds:itemID="{99FF8242-58E7-41D7-BB00-92C555CA4AB3}">
+<ds:datastoreItem xmlns:ds="http://schemas.openxmlformats.org/officeDocument/2006/customXml" ds:itemID="{EE96830A-08F8-4BF7-9702-00F53B4F7FB4}">
   <ds:schemaRefs>
-    <ds:schemaRef ds:uri="http://schemas.microsoft.com/office/2006/metadata/properties"/>
-    <ds:schemaRef ds:uri="http://schemas.microsoft.com/office/infopath/2007/PartnerControls"/>
-    <ds:schemaRef ds:uri="d598189d-5e7f-4257-b434-a18cd152a466"/>
-    <ds:schemaRef ds:uri="1be0cd79-b20d-4c5a-bbde-e8a9c50088cd"/>
+    <ds:schemaRef ds:uri="http://schemas.microsoft.com/sharepoint/v3/contenttype/forms"/>
   </ds:schemaRefs>
 </ds:datastoreItem>
 </file>
@@ -6452,9 +6465,12 @@
 </file>
 
 <file path=customXml/itemProps3.xml><?xml version="1.0" encoding="utf-8"?>
-<ds:datastoreItem xmlns:ds="http://schemas.openxmlformats.org/officeDocument/2006/customXml" ds:itemID="{EE96830A-08F8-4BF7-9702-00F53B4F7FB4}">
+<ds:datastoreItem xmlns:ds="http://schemas.openxmlformats.org/officeDocument/2006/customXml" ds:itemID="{99FF8242-58E7-41D7-BB00-92C555CA4AB3}">
   <ds:schemaRefs>
-    <ds:schemaRef ds:uri="http://schemas.microsoft.com/sharepoint/v3/contenttype/forms"/>
+    <ds:schemaRef ds:uri="http://schemas.microsoft.com/office/2006/metadata/properties"/>
+    <ds:schemaRef ds:uri="http://schemas.microsoft.com/office/infopath/2007/PartnerControls"/>
+    <ds:schemaRef ds:uri="d598189d-5e7f-4257-b434-a18cd152a466"/>
+    <ds:schemaRef ds:uri="1be0cd79-b20d-4c5a-bbde-e8a9c50088cd"/>
   </ds:schemaRefs>
 </ds:datastoreItem>
 </file>
</xml_diff>